<commit_message>
Update contract clauses 13.1 and 14.2 and the innovation share in the annex
Doplnená e-mailová adresa dlžníka (§ 13.1), bod 14.2 skrátený len na
potvrdenie o daňovej rezidencii. V prílohe: IT systémy zavádzané od roku
2026, na IT a inovácie vyčlenených cca 20 % úveru, upravené rozdelenie
použitia prostriedkov a harmonogram.

Co-Authored-By: Claude Fable 5.1 <noreply@anthropic.com>
Claude-Session: https://claude.ai/code/session_01Y2BwyWrz2zGDUPQB2oEzRk
</commit_message>
<xml_diff>
--- a/business-plan/Zmluva_o_uvere_BauHausEurope_GR_Construction_doplnena.docx
+++ b/business-plan/Zmluva_o_uvere_BauHausEurope_GR_Construction_doplnena.docx
@@ -1346,7 +1346,7 @@
       <w:r>
         <w:t>13.1</w:t>
         <w:tab/>
-        <w:t>Písomnosti podľa tejto Zmluvy sa doručujú na adresy sídla Zmluvných strán uvedené v záhlaví alebo na e-mailové adresy: Veriteľ: [__________]; Dlžník: [__________]. Oznámenie o predčasnom splatení (bod 5.3) a oznámenie o predĺžení splatnosti (bod 5.4) sa doručujú doporučenou zásielkou alebo e-mailom s potvrdením prijatia; za doručené sa považujú dňom prijatia, inak tretím pracovným dňom po odoslaní.</w:t>
+        <w:t>Písomnosti podľa tejto Zmluvy sa doručujú na adresy sídla Zmluvných strán uvedené v záhlaví alebo na e-mailové adresy: Veriteľ: [__________]; Dlžník: info@bauhauseurope.de. Oznámenie o predčasnom splatení (bod 5.3) a oznámenie o predĺžení splatnosti (bod 5.4) sa doručujú doporučenou zásielkou alebo e-mailom s potvrdením prijatia; za doručené sa považujú dňom prijatia, inak tretím pracovným dňom po odoslaní.</w:t>
       </w:r>
     </w:p>
     <w:p>
@@ -1390,9 +1390,9 @@
       <w:r>
         <w:t>14.2</w:t>
         <w:tab/>
-        <w:t xml:space="preserve">Veriteľ poskytne Dlžníkovi potvrdenie o daňovej rezidencii a ďalšie doklady potrebné na uplatnenie Zmluvy medzi Československou socialistickou republikou a Švédskym kráľovstvom o zamedzení dvojakého zdanenia v odbore daní z príjmu a z majetku (uverejnenej pod č. </w:t>
+        <w:t xml:space="preserve">Veriteľ poskytne Dlžníkovi potvrdenie o daňovej rezidencii.</w:t>
         <w:lastRenderedPageBreak/>
-        <w:t>9/1981 Zb.), prípadne inej platnej zmluvy o zamedzení dvojitého zdanenia, a Dlžník vystaví Veriteľovi potvrdenie o zrazenej dani.</w:t>
+        <w:t/>
       </w:r>
     </w:p>
     <w:p>

</xml_diff>